<commit_message>
chuẩn bị data bước đầu
</commit_message>
<xml_diff>
--- a/Giai_thich_bang_CSDL_Chatbot_TOEIC.docx
+++ b/Giai_thich_bang_CSDL_Chatbot_TOEIC.docx
@@ -669,6 +669,141 @@
                     <a:xfrm>
                       <a:off x="0" y="0"/>
                       <a:ext cx="5486400" cy="1934845"/>
+                    </a:xfrm>
+                    <a:prstGeom prst="rect">
+                      <a:avLst/>
+                    </a:prstGeom>
+                  </pic:spPr>
+                </pic:pic>
+              </a:graphicData>
+            </a:graphic>
+          </wp:inline>
+        </w:drawing>
+      </w:r>
+    </w:p>
+    <w:p>
+      <w:pPr>
+        <w:pStyle w:val="ListBullet"/>
+        <w:numPr>
+          <w:ilvl w:val="0"/>
+          <w:numId w:val="0"/>
+        </w:numPr>
+        <w:ind w:left="360" w:hanging="360"/>
+      </w:pPr>
+    </w:p>
+    <w:p>
+      <w:pPr>
+        <w:pStyle w:val="ListBullet"/>
+        <w:numPr>
+          <w:ilvl w:val="0"/>
+          <w:numId w:val="0"/>
+        </w:numPr>
+        <w:ind w:left="360" w:hanging="360"/>
+      </w:pPr>
+    </w:p>
+    <w:p>
+      <w:pPr>
+        <w:pStyle w:val="ListBullet"/>
+        <w:numPr>
+          <w:ilvl w:val="0"/>
+          <w:numId w:val="0"/>
+        </w:numPr>
+        <w:ind w:left="360" w:hanging="360"/>
+      </w:pPr>
+    </w:p>
+    <w:p>
+      <w:pPr>
+        <w:pStyle w:val="ListBullet"/>
+        <w:numPr>
+          <w:ilvl w:val="0"/>
+          <w:numId w:val="0"/>
+        </w:numPr>
+        <w:ind w:left="360" w:hanging="360"/>
+      </w:pPr>
+    </w:p>
+    <w:p>
+      <w:pPr>
+        <w:pStyle w:val="ListBullet"/>
+        <w:numPr>
+          <w:ilvl w:val="0"/>
+          <w:numId w:val="0"/>
+        </w:numPr>
+        <w:ind w:left="360" w:hanging="360"/>
+      </w:pPr>
+      <w:r>
+        <w:lastRenderedPageBreak/>
+        <w:drawing>
+          <wp:inline distT="0" distB="0" distL="0" distR="0" wp14:anchorId="4552D1CB" wp14:editId="3AD93D75">
+            <wp:extent cx="5486400" cy="2162175"/>
+            <wp:effectExtent l="0" t="0" r="0" b="9525"/>
+            <wp:docPr id="1097131757" name="Picture 1"/>
+            <wp:cNvGraphicFramePr>
+              <a:graphicFrameLocks xmlns:a="http://schemas.openxmlformats.org/drawingml/2006/main" noChangeAspect="1"/>
+            </wp:cNvGraphicFramePr>
+            <a:graphic xmlns:a="http://schemas.openxmlformats.org/drawingml/2006/main">
+              <a:graphicData uri="http://schemas.openxmlformats.org/drawingml/2006/picture">
+                <pic:pic xmlns:pic="http://schemas.openxmlformats.org/drawingml/2006/picture">
+                  <pic:nvPicPr>
+                    <pic:cNvPr id="1097131757" name=""/>
+                    <pic:cNvPicPr/>
+                  </pic:nvPicPr>
+                  <pic:blipFill>
+                    <a:blip r:embed="rId11"/>
+                    <a:stretch>
+                      <a:fillRect/>
+                    </a:stretch>
+                  </pic:blipFill>
+                  <pic:spPr>
+                    <a:xfrm>
+                      <a:off x="0" y="0"/>
+                      <a:ext cx="5486400" cy="2162175"/>
+                    </a:xfrm>
+                    <a:prstGeom prst="rect">
+                      <a:avLst/>
+                    </a:prstGeom>
+                  </pic:spPr>
+                </pic:pic>
+              </a:graphicData>
+            </a:graphic>
+          </wp:inline>
+        </w:drawing>
+      </w:r>
+    </w:p>
+    <w:p>
+      <w:pPr>
+        <w:pStyle w:val="ListBullet"/>
+        <w:numPr>
+          <w:ilvl w:val="0"/>
+          <w:numId w:val="0"/>
+        </w:numPr>
+        <w:ind w:left="360" w:hanging="360"/>
+      </w:pPr>
+      <w:r>
+        <w:drawing>
+          <wp:inline distT="0" distB="0" distL="0" distR="0" wp14:anchorId="11CED61E" wp14:editId="24D105AD">
+            <wp:extent cx="5486400" cy="3898265"/>
+            <wp:effectExtent l="0" t="0" r="0" b="6985"/>
+            <wp:docPr id="1687750616" name="Picture 1"/>
+            <wp:cNvGraphicFramePr>
+              <a:graphicFrameLocks xmlns:a="http://schemas.openxmlformats.org/drawingml/2006/main" noChangeAspect="1"/>
+            </wp:cNvGraphicFramePr>
+            <a:graphic xmlns:a="http://schemas.openxmlformats.org/drawingml/2006/main">
+              <a:graphicData uri="http://schemas.openxmlformats.org/drawingml/2006/picture">
+                <pic:pic xmlns:pic="http://schemas.openxmlformats.org/drawingml/2006/picture">
+                  <pic:nvPicPr>
+                    <pic:cNvPr id="1687750616" name=""/>
+                    <pic:cNvPicPr/>
+                  </pic:nvPicPr>
+                  <pic:blipFill>
+                    <a:blip r:embed="rId12"/>
+                    <a:stretch>
+                      <a:fillRect/>
+                    </a:stretch>
+                  </pic:blipFill>
+                  <pic:spPr>
+                    <a:xfrm>
+                      <a:off x="0" y="0"/>
+                      <a:ext cx="5486400" cy="3898265"/>
                     </a:xfrm>
                     <a:prstGeom prst="rect">
                       <a:avLst/>

</xml_diff>